<commit_message>
Send all four inquiries at once; the waiver question goes first
Erick pointed out the inconsistency: I said inquiries cost nothing and are not
exclusive, then held one back. There was no reason for it.

The ImmunoInformatics inquiry is now first rather than in reserve, because it
carries the one question that could reorder the whole plan. Scope is not in doubt
there - they publish the IMMREP post-mortems - so the only real unknown is the fee.
A granted waiver makes that journal both the best scientific fit and free, moving
it from fifth choice to first. Asking costs an email; learning it after three
rejections costs months.

venue-plan.md now decides by reply rather than by fixed order, and records that
cost is the only thing keeping ImmunoInformatics at number five.
</commit_message>
<xml_diff>
--- a/paper/Presubmission_Inquiries.docx
+++ b/paper/Presubmission_Inquiries.docx
@@ -2,7 +2,7 @@
 <file path=word/document.xml><?xml version="1.0" encoding="utf-8"?>
 <w:document xmlns:w="http://schemas.openxmlformats.org/wordprocessingml/2006/main" xmlns:m="http://schemas.openxmlformats.org/officeDocument/2006/math" xmlns:r="http://schemas.openxmlformats.org/officeDocument/2006/relationships" xmlns:o="urn:schemas-microsoft-com:office:office" xmlns:v="urn:schemas-microsoft-com:vml" xmlns:w10="urn:schemas-microsoft-com:office:word" xmlns:a="http://schemas.openxmlformats.org/drawingml/2006/main" xmlns:pic="http://schemas.openxmlformats.org/drawingml/2006/picture" xmlns:wp="http://schemas.openxmlformats.org/drawingml/2006/wordprocessingDrawing">
   <w:body>
-    <w:bookmarkStart w:id="16" w:name="pre-submission-inquiry-emails"/>
+    <w:bookmarkStart w:id="17" w:name="pre-submission-inquiry-emails"/>
     <w:p>
       <w:pPr>
         <w:pStyle w:val="Heading1"/>
@@ -265,13 +265,25 @@
           <w:b/>
           <w:bCs/>
         </w:rPr>
-        <w:t xml:space="preserve">Send all of them the same day.</w:t>
-      </w:r>
-      <w:r>
-        <w:t xml:space="preserve"> </w:t>
-      </w:r>
-      <w:r>
-        <w:t xml:space="preserve">Inquiries are not exclusive; submissions are.</w:t>
+        <w:t xml:space="preserve">Send all four the same day.</w:t>
+      </w:r>
+      <w:r>
+        <w:t xml:space="preserve"> </w:t>
+      </w:r>
+      <w:r>
+        <w:t xml:space="preserve">Inquiries are not exclusive; submissions are. A</w:t>
+      </w:r>
+      <w:r>
+        <w:t xml:space="preserve"> </w:t>
+      </w:r>
+      <w:r>
+        <w:t xml:space="preserve">positive reply obligates you to nothing, so there is no reason to stagger them</w:t>
+      </w:r>
+      <w:r>
+        <w:t xml:space="preserve"> </w:t>
+      </w:r>
+      <w:r>
+        <w:t xml:space="preserve">or to hold any venue back.</w:t>
       </w:r>
     </w:p>
     <w:p>
@@ -297,7 +309,75 @@
       </w:r>
     </w:p>
     <w:bookmarkEnd w:id="9"/>
-    <w:bookmarkStart w:id="10" w:name="reading-the-reply"/>
+    <w:bookmarkStart w:id="10" w:name="the-question-worth-asking-first"/>
+    <w:p>
+      <w:pPr>
+        <w:pStyle w:val="Heading2"/>
+      </w:pPr>
+      <w:r>
+        <w:t xml:space="preserve">The question worth asking first</w:t>
+      </w:r>
+    </w:p>
+    <w:p>
+      <w:pPr>
+        <w:pStyle w:val="FirstParagraph"/>
+      </w:pPr>
+      <w:r>
+        <w:t xml:space="preserve">The single most decision-relevant unknown in the whole venue plan is whether</w:t>
+      </w:r>
+      <w:r>
+        <w:t xml:space="preserve"> </w:t>
+      </w:r>
+      <w:r>
+        <w:t xml:space="preserve">ImmunoInformatics will waive its USD 1,900 fee. Everything else about that journal</w:t>
+      </w:r>
+      <w:r>
+        <w:t xml:space="preserve"> </w:t>
+      </w:r>
+      <w:r>
+        <w:t xml:space="preserve">already favours it — it published both IMMREP workshop reports, so its editors and</w:t>
+      </w:r>
+      <w:r>
+        <w:t xml:space="preserve"> </w:t>
+      </w:r>
+      <w:r>
+        <w:t xml:space="preserve">reviewers are the community that built the benchmark you scored yourself against,</w:t>
+      </w:r>
+      <w:r>
+        <w:t xml:space="preserve"> </w:t>
+      </w:r>
+      <w:r>
+        <w:t xml:space="preserve">and a negative benchmarking result needs no justification there.</w:t>
+      </w:r>
+    </w:p>
+    <w:p>
+      <w:pPr>
+        <w:pStyle w:val="BodyText"/>
+      </w:pPr>
+      <w:r>
+        <w:t xml:space="preserve">Cost is the only thing pushing it to fifth place in</w:t>
+      </w:r>
+      <w:r>
+        <w:t xml:space="preserve"> </w:t>
+      </w:r>
+      <w:r>
+        <w:rPr>
+          <w:rStyle w:val="VerbatimChar"/>
+        </w:rPr>
+        <w:t xml:space="preserve">paper/venue-plan.md</w:t>
+      </w:r>
+      <w:r>
+        <w:t xml:space="preserve">. If a</w:t>
+      </w:r>
+      <w:r>
+        <w:t xml:space="preserve"> </w:t>
+      </w:r>
+      <w:r>
+        <w:t xml:space="preserve">waiver is available, it goes to first. Ask on day one, not after three rejections.</w:t>
+      </w:r>
+    </w:p>
+    <w:bookmarkEnd w:id="10"/>
+    <w:bookmarkStart w:id="11" w:name="reading-the-reply"/>
     <w:p>
       <w:pPr>
         <w:pStyle w:val="Heading2"/>
@@ -441,8 +521,8 @@
         </w:pict>
       </w:r>
     </w:p>
-    <w:bookmarkEnd w:id="10"/>
-    <w:bookmarkStart w:id="11" w:name="X8f4cb513262d9d74e49c36d28eb4ab3dffb244b"/>
+    <w:bookmarkEnd w:id="11"/>
+    <w:bookmarkStart w:id="12" w:name="X8f4cb513262d9d74e49c36d28eb4ab3dffb244b"/>
     <w:p>
       <w:pPr>
         <w:pStyle w:val="Heading2"/>
@@ -634,8 +714,8 @@
         <w:t xml:space="preserve">erick.tejkowski@gmail.com</w:t>
       </w:r>
     </w:p>
-    <w:bookmarkEnd w:id="11"/>
-    <w:bookmarkStart w:id="12" w:name="X486f2a59c489178d82c083843b40de19183e310"/>
+    <w:bookmarkEnd w:id="12"/>
+    <w:bookmarkStart w:id="13" w:name="X486f2a59c489178d82c083843b40de19183e310"/>
     <w:p>
       <w:pPr>
         <w:pStyle w:val="Heading2"/>
@@ -805,8 +885,8 @@
         <w:t xml:space="preserve">[as above]</w:t>
       </w:r>
     </w:p>
-    <w:bookmarkEnd w:id="12"/>
-    <w:bookmarkStart w:id="13" w:name="molecular-immunology-elsevier"/>
+    <w:bookmarkEnd w:id="13"/>
+    <w:bookmarkStart w:id="14" w:name="molecular-immunology-elsevier"/>
     <w:p>
       <w:pPr>
         <w:pStyle w:val="Heading2"/>
@@ -968,14 +1048,14 @@
         <w:t xml:space="preserve">[as above]</w:t>
       </w:r>
     </w:p>
-    <w:bookmarkEnd w:id="13"/>
-    <w:bookmarkStart w:id="14" w:name="X302f28bbf5c4297ff68e44d096ee4cd02b516f0"/>
+    <w:bookmarkEnd w:id="14"/>
+    <w:bookmarkStart w:id="15" w:name="X884910238f8e96dcdcccca67ab47c8013666c8b"/>
     <w:p>
       <w:pPr>
         <w:pStyle w:val="Heading2"/>
       </w:pPr>
       <w:r>
-        <w:t xml:space="preserve">4. ImmunoInformatics (Elsevier) — hold in reserve</w:t>
+        <w:t xml:space="preserve">4. ImmunoInformatics (Elsevier) — send this one first</w:t>
       </w:r>
     </w:p>
     <w:p>
@@ -983,19 +1063,85 @@
         <w:pStyle w:val="FirstParagraph"/>
       </w:pPr>
       <w:r>
-        <w:t xml:space="preserve">Only send this if the free venues decline on scope. No inquiry is really needed —</w:t>
-      </w:r>
-      <w:r>
-        <w:t xml:space="preserve"> </w:t>
-      </w:r>
-      <w:r>
-        <w:t xml:space="preserve">they publish the IMMREP post-mortems, so scope is not in doubt — but it is worth</w:t>
-      </w:r>
-      <w:r>
-        <w:t xml:space="preserve"> </w:t>
-      </w:r>
-      <w:r>
-        <w:t xml:space="preserve">asking about a fee waiver in the same message.</w:t>
+        <w:t xml:space="preserve">Send it with the others, on the same day. There is no reason to hold it back:</w:t>
+      </w:r>
+      <w:r>
+        <w:t xml:space="preserve"> </w:t>
+      </w:r>
+      <w:r>
+        <w:t xml:space="preserve">asking costs nothing, inquiries are not exclusive, and a</w:t>
+      </w:r>
+      <w:r>
+        <w:t xml:space="preserve"> </w:t>
+      </w:r>
+      <w:r>
+        <w:t xml:space="preserve">“yes”</w:t>
+      </w:r>
+      <w:r>
+        <w:t xml:space="preserve"> </w:t>
+      </w:r>
+      <w:r>
+        <w:t xml:space="preserve">obligates you to</w:t>
+      </w:r>
+      <w:r>
+        <w:t xml:space="preserve"> </w:t>
+      </w:r>
+      <w:r>
+        <w:t xml:space="preserve">nothing.</w:t>
+      </w:r>
+    </w:p>
+    <w:p>
+      <w:pPr>
+        <w:pStyle w:val="BodyText"/>
+      </w:pPr>
+      <w:r>
+        <w:t xml:space="preserve">It is arguably the</w:t>
+      </w:r>
+      <w:r>
+        <w:t xml:space="preserve"> </w:t>
+      </w:r>
+      <w:r>
+        <w:rPr>
+          <w:b/>
+          <w:bCs/>
+        </w:rPr>
+        <w:t xml:space="preserve">most</w:t>
+      </w:r>
+      <w:r>
+        <w:t xml:space="preserve"> </w:t>
+      </w:r>
+      <w:r>
+        <w:t xml:space="preserve">valuable of the four, because it carries the one</w:t>
+      </w:r>
+      <w:r>
+        <w:t xml:space="preserve"> </w:t>
+      </w:r>
+      <w:r>
+        <w:t xml:space="preserve">question whose answer could reorder the entire plan. Scope is not in doubt — this</w:t>
+      </w:r>
+      <w:r>
+        <w:t xml:space="preserve"> </w:t>
+      </w:r>
+      <w:r>
+        <w:t xml:space="preserve">journal publishes the IMMREP post-mortems — so the real unknown is the fee. If a</w:t>
+      </w:r>
+      <w:r>
+        <w:t xml:space="preserve"> </w:t>
+      </w:r>
+      <w:r>
+        <w:t xml:space="preserve">waiver is available, ImmunoInformatics becomes both the best scientific fit and</w:t>
+      </w:r>
+      <w:r>
+        <w:t xml:space="preserve"> </w:t>
+      </w:r>
+      <w:r>
+        <w:t xml:space="preserve">free, and it goes from fifth choice to first. If no waiver is available, you have</w:t>
+      </w:r>
+      <w:r>
+        <w:t xml:space="preserve"> </w:t>
+      </w:r>
+      <w:r>
+        <w:t xml:space="preserve">learned that for the price of an email.</w:t>
       </w:r>
     </w:p>
     <w:p>
@@ -1157,8 +1303,8 @@
         </w:pict>
       </w:r>
     </w:p>
-    <w:bookmarkEnd w:id="14"/>
-    <w:bookmarkStart w:id="15" w:name="before-sending"/>
+    <w:bookmarkEnd w:id="15"/>
+    <w:bookmarkStart w:id="16" w:name="before-sending"/>
     <w:p>
       <w:pPr>
         <w:pStyle w:val="Heading2"/>
@@ -1202,8 +1348,8 @@
         <w:t xml:space="preserve">emails claims anything the paper does not support.</w:t>
       </w:r>
     </w:p>
-    <w:bookmarkEnd w:id="15"/>
     <w:bookmarkEnd w:id="16"/>
+    <w:bookmarkEnd w:id="17"/>
     <w:sectPr>
       <w:footnotePr>
         <w:numRestart w:val="eachSect"/>

</xml_diff>